<commit_message>
Rendu TP2 : mise à jour
</commit_message>
<xml_diff>
--- a/rendu/Rendu_TP2_TaskFlow_v1.docx
+++ b/rendu/Rendu_TP2_TaskFlow_v1.docx
@@ -17,16 +17,18 @@
           <w:tab w:val="left" w:pos="6480"/>
           <w:tab w:val="left" w:pos="7200"/>
           <w:tab w:val="left" w:pos="7920"/>
-          <w:tab w:val="left" w:pos="8640"/>
+          <w:tab w:val="left" w:pos="8520"/>
         </w:tabs>
         <w:jc w:val="center"/>
         <w:rPr>
+          <w:rStyle w:val="Aucun"/>
           <w:sz w:val="40"/>
           <w:szCs w:val="40"/>
         </w:rPr>
       </w:pPr>
       <w:r>
         <w:rPr>
+          <w:rStyle w:val="Aucun"/>
           <w:sz w:val="40"/>
           <w:szCs w:val="40"/>
           <w:rtl w:val="0"/>
@@ -36,14 +38,17 @@
       </w:r>
       <w:r>
         <w:rPr>
+          <w:rStyle w:val="Aucun"/>
           <w:sz w:val="40"/>
           <w:szCs w:val="40"/>
           <w:rtl w:val="0"/>
+          <w:lang w:val="fr-FR"/>
         </w:rPr>
         <w:t xml:space="preserve">– </w:t>
       </w:r>
       <w:r>
         <w:rPr>
+          <w:rStyle w:val="Aucun"/>
           <w:sz w:val="40"/>
           <w:szCs w:val="40"/>
           <w:rtl w:val="0"/>
@@ -54,12 +59,12 @@
     </w:p>
     <w:p>
       <w:pPr>
-        <w:pStyle w:val="Corps"/>
+        <w:pStyle w:val="Corps A"/>
       </w:pPr>
     </w:p>
     <w:p>
       <w:pPr>
-        <w:pStyle w:val="Corps"/>
+        <w:pStyle w:val="Corps A"/>
         <w:spacing w:after="120"/>
       </w:pPr>
       <w:r>
@@ -74,6 +79,7 @@
         <w:rPr>
           <w:rStyle w:val="Aucun"/>
           <w:rtl w:val="0"/>
+          <w:lang w:val="fr-FR"/>
         </w:rPr>
         <w:t>â</w:t>
       </w:r>
@@ -120,7 +126,7 @@
     </w:p>
     <w:p>
       <w:pPr>
-        <w:pStyle w:val="Titre"/>
+        <w:pStyle w:val="Titre A"/>
       </w:pPr>
       <w:r>
         <w:rPr>
@@ -133,7 +139,7 @@
     </w:p>
     <w:p>
       <w:pPr>
-        <w:pStyle w:val="Corps"/>
+        <w:pStyle w:val="Corps A"/>
         <w:spacing w:after="120"/>
       </w:pPr>
       <w:r>
@@ -189,6 +195,7 @@
           <w:sz w:val="20"/>
           <w:szCs w:val="20"/>
           <w:rtl w:val="0"/>
+          <w:lang w:val="fr-FR"/>
         </w:rPr>
         <w:t>npm install</w:t>
       </w:r>
@@ -222,7 +229,7 @@
     </w:p>
     <w:p>
       <w:pPr>
-        <w:pStyle w:val="Titre"/>
+        <w:pStyle w:val="Titre A"/>
       </w:pPr>
       <w:r>
         <w:rPr>
@@ -244,6 +251,7 @@
         <w:rPr>
           <w:rStyle w:val="Aucun"/>
           <w:rtl w:val="0"/>
+          <w:lang w:val="fr-FR"/>
         </w:rPr>
         <w:t>alis</w:t>
       </w:r>
@@ -260,7 +268,7 @@
       <w:tblPr>
         <w:tblW w:w="9026" w:type="dxa"/>
         <w:jc w:val="left"/>
-        <w:tblInd w:w="108" w:type="dxa"/>
+        <w:tblInd w:w="216" w:type="dxa"/>
         <w:tblBorders>
           <w:top w:val="single" w:color="ffffff" w:sz="8" w:space="0" w:shadow="0" w:frame="0"/>
           <w:left w:val="single" w:color="ffffff" w:sz="8" w:space="0" w:shadow="0" w:frame="0"/>
@@ -282,7 +290,7 @@
           <w:shd w:val="clear" w:color="auto" w:fill="4472c4"/>
         </w:tblPrEx>
         <w:trPr>
-          <w:trHeight w:val="221" w:hRule="atLeast"/>
+          <w:trHeight w:val="231" w:hRule="atLeast"/>
           <w:tblHeader/>
         </w:trPr>
         <w:tc>
@@ -305,7 +313,7 @@
           </w:tcPr>
           <w:p>
             <w:pPr>
-              <w:pStyle w:val="Corps"/>
+              <w:pStyle w:val="Corps A"/>
             </w:pPr>
             <w:r>
               <w:rPr>
@@ -325,6 +333,7 @@
                 <w:bCs w:val="1"/>
                 <w:shd w:val="nil" w:color="auto" w:fill="auto"/>
                 <w:rtl w:val="0"/>
+                <w:lang w:val="fr-FR"/>
               </w:rPr>
               <w:t>tape</w:t>
             </w:r>
@@ -350,7 +359,7 @@
           </w:tcPr>
           <w:p>
             <w:pPr>
-              <w:pStyle w:val="Corps"/>
+              <w:pStyle w:val="Corps A"/>
             </w:pPr>
             <w:r>
               <w:rPr>
@@ -385,7 +394,7 @@
           </w:tcPr>
           <w:p>
             <w:pPr>
-              <w:pStyle w:val="Corps"/>
+              <w:pStyle w:val="Corps A"/>
             </w:pPr>
             <w:r>
               <w:rPr>
@@ -406,7 +415,7 @@
           <w:shd w:val="clear" w:color="auto" w:fill="cdd4e9"/>
         </w:tblPrEx>
         <w:trPr>
-          <w:trHeight w:val="759" w:hRule="atLeast"/>
+          <w:trHeight w:val="769" w:hRule="atLeast"/>
         </w:trPr>
         <w:tc>
           <w:tcPr>
@@ -428,13 +437,14 @@
           </w:tcPr>
           <w:p>
             <w:pPr>
-              <w:pStyle w:val="Corps"/>
+              <w:pStyle w:val="Corps A"/>
             </w:pPr>
             <w:r>
               <w:rPr>
                 <w:rStyle w:val="Aucun"/>
                 <w:shd w:val="nil" w:color="auto" w:fill="auto"/>
                 <w:rtl w:val="0"/>
+                <w:lang w:val="fr-FR"/>
               </w:rPr>
               <w:t>1</w:t>
             </w:r>
@@ -460,7 +470,7 @@
           </w:tcPr>
           <w:p>
             <w:pPr>
-              <w:pStyle w:val="Corps"/>
+              <w:pStyle w:val="Corps A"/>
             </w:pPr>
             <w:r>
               <w:rPr>
@@ -496,7 +506,7 @@
           </w:tcPr>
           <w:p>
             <w:pPr>
-              <w:pStyle w:val="Corps"/>
+              <w:pStyle w:val="Corps A"/>
             </w:pPr>
             <w:r>
               <w:rPr>
@@ -530,6 +540,7 @@
                 <w:rStyle w:val="Aucun"/>
                 <w:shd w:val="nil" w:color="auto" w:fill="auto"/>
                 <w:rtl w:val="0"/>
+                <w:lang w:val="fr-FR"/>
               </w:rPr>
               <w:t xml:space="preserve">à </w:t>
             </w:r>
@@ -598,6 +609,7 @@
                 <w:szCs w:val="20"/>
                 <w:shd w:val="nil" w:color="auto" w:fill="auto"/>
                 <w:rtl w:val="0"/>
+                <w:lang w:val="fr-FR"/>
               </w:rPr>
               <w:t>App</w:t>
             </w:r>
@@ -609,7 +621,7 @@
           <w:shd w:val="clear" w:color="auto" w:fill="cdd4e9"/>
         </w:tblPrEx>
         <w:trPr>
-          <w:trHeight w:val="499" w:hRule="atLeast"/>
+          <w:trHeight w:val="509" w:hRule="atLeast"/>
         </w:trPr>
         <w:tc>
           <w:tcPr>
@@ -631,13 +643,14 @@
           </w:tcPr>
           <w:p>
             <w:pPr>
-              <w:pStyle w:val="Corps"/>
+              <w:pStyle w:val="Corps A"/>
             </w:pPr>
             <w:r>
               <w:rPr>
                 <w:rStyle w:val="Aucun"/>
                 <w:shd w:val="nil" w:color="auto" w:fill="auto"/>
                 <w:rtl w:val="0"/>
+                <w:lang w:val="fr-FR"/>
               </w:rPr>
               <w:t>2</w:t>
             </w:r>
@@ -663,7 +676,7 @@
           </w:tcPr>
           <w:p>
             <w:pPr>
-              <w:pStyle w:val="Corps"/>
+              <w:pStyle w:val="Corps A"/>
             </w:pPr>
             <w:r>
               <w:rPr>
@@ -673,6 +686,7 @@
                 <w:szCs w:val="20"/>
                 <w:shd w:val="nil" w:color="auto" w:fill="auto"/>
                 <w:rtl w:val="0"/>
+                <w:lang w:val="fr-FR"/>
               </w:rPr>
               <w:t>src/App.tsx</w:t>
             </w:r>
@@ -698,7 +712,7 @@
           </w:tcPr>
           <w:p>
             <w:pPr>
-              <w:pStyle w:val="Corps"/>
+              <w:pStyle w:val="Corps A"/>
             </w:pPr>
             <w:r>
               <w:rPr>
@@ -792,6 +806,7 @@
                 <w:rStyle w:val="Aucun"/>
                 <w:shd w:val="nil" w:color="auto" w:fill="auto"/>
                 <w:rtl w:val="0"/>
+                <w:lang w:val="fr-FR"/>
               </w:rPr>
               <w:t>, d</w:t>
             </w:r>
@@ -833,7 +848,7 @@
           <w:shd w:val="clear" w:color="auto" w:fill="cdd4e9"/>
         </w:tblPrEx>
         <w:trPr>
-          <w:trHeight w:val="490" w:hRule="atLeast"/>
+          <w:trHeight w:val="500" w:hRule="atLeast"/>
         </w:trPr>
         <w:tc>
           <w:tcPr>
@@ -855,13 +870,14 @@
           </w:tcPr>
           <w:p>
             <w:pPr>
-              <w:pStyle w:val="Corps"/>
+              <w:pStyle w:val="Corps A"/>
             </w:pPr>
             <w:r>
               <w:rPr>
                 <w:rStyle w:val="Aucun"/>
                 <w:shd w:val="nil" w:color="auto" w:fill="auto"/>
                 <w:rtl w:val="0"/>
+                <w:lang w:val="fr-FR"/>
               </w:rPr>
               <w:t>3</w:t>
             </w:r>
@@ -887,7 +903,7 @@
           </w:tcPr>
           <w:p>
             <w:pPr>
-              <w:pStyle w:val="Corps"/>
+              <w:pStyle w:val="Corps A"/>
             </w:pPr>
             <w:r>
               <w:rPr>
@@ -923,7 +939,7 @@
           </w:tcPr>
           <w:p>
             <w:pPr>
-              <w:pStyle w:val="Corps"/>
+              <w:pStyle w:val="Corps A"/>
             </w:pPr>
             <w:r>
               <w:rPr>
@@ -993,7 +1009,7 @@
           <w:shd w:val="clear" w:color="auto" w:fill="cdd4e9"/>
         </w:tblPrEx>
         <w:trPr>
-          <w:trHeight w:val="499" w:hRule="atLeast"/>
+          <w:trHeight w:val="509" w:hRule="atLeast"/>
         </w:trPr>
         <w:tc>
           <w:tcPr>
@@ -1015,13 +1031,14 @@
           </w:tcPr>
           <w:p>
             <w:pPr>
-              <w:pStyle w:val="Corps"/>
+              <w:pStyle w:val="Corps A"/>
             </w:pPr>
             <w:r>
               <w:rPr>
                 <w:rStyle w:val="Aucun"/>
                 <w:shd w:val="nil" w:color="auto" w:fill="auto"/>
                 <w:rtl w:val="0"/>
+                <w:lang w:val="fr-FR"/>
               </w:rPr>
               <w:t>4</w:t>
             </w:r>
@@ -1047,7 +1064,7 @@
           </w:tcPr>
           <w:p>
             <w:pPr>
-              <w:pStyle w:val="Corps"/>
+              <w:pStyle w:val="Corps A"/>
             </w:pPr>
             <w:r>
               <w:rPr>
@@ -1057,6 +1074,7 @@
                 <w:szCs w:val="20"/>
                 <w:shd w:val="nil" w:color="auto" w:fill="auto"/>
                 <w:rtl w:val="0"/>
+                <w:lang w:val="fr-FR"/>
               </w:rPr>
               <w:t>TaskForm.tsx</w:t>
             </w:r>
@@ -1065,6 +1083,7 @@
                 <w:rStyle w:val="Aucun"/>
                 <w:shd w:val="nil" w:color="auto" w:fill="auto"/>
                 <w:rtl w:val="0"/>
+                <w:lang w:val="fr-FR"/>
               </w:rPr>
               <w:t xml:space="preserve">, </w:t>
             </w:r>
@@ -1076,6 +1095,7 @@
                 <w:szCs w:val="20"/>
                 <w:shd w:val="nil" w:color="auto" w:fill="auto"/>
                 <w:rtl w:val="0"/>
+                <w:lang w:val="fr-FR"/>
               </w:rPr>
               <w:t>App.tsx</w:t>
             </w:r>
@@ -1101,7 +1121,7 @@
           </w:tcPr>
           <w:p>
             <w:pPr>
-              <w:pStyle w:val="Corps"/>
+              <w:pStyle w:val="Corps A"/>
             </w:pPr>
             <w:r>
               <w:rPr>
@@ -1153,7 +1173,7 @@
           <w:shd w:val="clear" w:color="auto" w:fill="cdd4e9"/>
         </w:tblPrEx>
         <w:trPr>
-          <w:trHeight w:val="759" w:hRule="atLeast"/>
+          <w:trHeight w:val="769" w:hRule="atLeast"/>
         </w:trPr>
         <w:tc>
           <w:tcPr>
@@ -1175,13 +1195,14 @@
           </w:tcPr>
           <w:p>
             <w:pPr>
-              <w:pStyle w:val="Corps"/>
+              <w:pStyle w:val="Corps A"/>
             </w:pPr>
             <w:r>
               <w:rPr>
                 <w:rStyle w:val="Aucun"/>
                 <w:shd w:val="nil" w:color="auto" w:fill="auto"/>
                 <w:rtl w:val="0"/>
+                <w:lang w:val="fr-FR"/>
               </w:rPr>
               <w:t>5</w:t>
             </w:r>
@@ -1207,7 +1228,7 @@
           </w:tcPr>
           <w:p>
             <w:pPr>
-              <w:pStyle w:val="Corps"/>
+              <w:pStyle w:val="Corps A"/>
             </w:pPr>
             <w:r>
               <w:rPr>
@@ -1243,7 +1264,7 @@
           </w:tcPr>
           <w:p>
             <w:pPr>
-              <w:pStyle w:val="Corps"/>
+              <w:pStyle w:val="Corps A"/>
             </w:pPr>
             <w:r>
               <w:rPr>
@@ -1376,7 +1397,7 @@
           <w:shd w:val="clear" w:color="auto" w:fill="cdd4e9"/>
         </w:tblPrEx>
         <w:trPr>
-          <w:trHeight w:val="759" w:hRule="atLeast"/>
+          <w:trHeight w:val="769" w:hRule="atLeast"/>
         </w:trPr>
         <w:tc>
           <w:tcPr>
@@ -1398,13 +1419,14 @@
           </w:tcPr>
           <w:p>
             <w:pPr>
-              <w:pStyle w:val="Corps"/>
+              <w:pStyle w:val="Corps A"/>
             </w:pPr>
             <w:r>
               <w:rPr>
                 <w:rStyle w:val="Aucun"/>
                 <w:shd w:val="nil" w:color="auto" w:fill="auto"/>
                 <w:rtl w:val="0"/>
+                <w:lang w:val="fr-FR"/>
               </w:rPr>
               <w:t>6</w:t>
             </w:r>
@@ -1430,7 +1452,7 @@
           </w:tcPr>
           <w:p>
             <w:pPr>
-              <w:pStyle w:val="Corps"/>
+              <w:pStyle w:val="Corps A"/>
             </w:pPr>
             <w:r>
               <w:rPr>
@@ -1449,6 +1471,7 @@
                 <w:rStyle w:val="Aucun"/>
                 <w:shd w:val="nil" w:color="auto" w:fill="auto"/>
                 <w:rtl w:val="0"/>
+                <w:lang w:val="fr-FR"/>
               </w:rPr>
               <w:t xml:space="preserve">, </w:t>
             </w:r>
@@ -1486,7 +1509,7 @@
           </w:tcPr>
           <w:p>
             <w:pPr>
-              <w:pStyle w:val="Corps"/>
+              <w:pStyle w:val="Corps A"/>
             </w:pPr>
             <w:r>
               <w:rPr>
@@ -1620,13 +1643,20 @@
     </w:tbl>
     <w:p>
       <w:pPr>
-        <w:pStyle w:val="Titre"/>
+        <w:pStyle w:val="Titre A"/>
+        <w:widowControl w:val="0"/>
+        <w:ind w:left="108" w:hanging="108"/>
+      </w:pPr>
+    </w:p>
+    <w:p>
+      <w:pPr>
+        <w:pStyle w:val="Titre A"/>
         <w:widowControl w:val="0"/>
       </w:pPr>
     </w:p>
     <w:p>
       <w:pPr>
-        <w:pStyle w:val="Titre"/>
+        <w:pStyle w:val="Titre A"/>
       </w:pPr>
       <w:r>
         <w:rPr>
@@ -1655,7 +1685,7 @@
     </w:p>
     <w:p>
       <w:pPr>
-        <w:pStyle w:val="Corps"/>
+        <w:pStyle w:val="Corps A"/>
         <w:keepNext w:val="1"/>
         <w:spacing w:before="200" w:after="60"/>
       </w:pPr>
@@ -1769,6 +1799,7 @@
         <w:rPr>
           <w:rStyle w:val="Aucun"/>
           <w:rtl w:val="0"/>
+          <w:lang w:val="fr-FR"/>
         </w:rPr>
         <w:t xml:space="preserve">à </w:t>
       </w:r>
@@ -1848,6 +1879,7 @@
         <w:rPr>
           <w:rStyle w:val="Aucun"/>
           <w:rtl w:val="0"/>
+          <w:lang w:val="fr-FR"/>
         </w:rPr>
         <w:t>â</w:t>
       </w:r>
@@ -1863,6 +1895,7 @@
         <w:rPr>
           <w:rStyle w:val="Aucun"/>
           <w:rtl w:val="0"/>
+          <w:lang w:val="fr-FR"/>
         </w:rPr>
         <w:t xml:space="preserve">à </w:t>
       </w:r>
@@ -1902,6 +1935,7 @@
         <w:rPr>
           <w:rStyle w:val="Aucun"/>
           <w:rtl w:val="0"/>
+          <w:lang w:val="fr-FR"/>
         </w:rPr>
         <w:t>j</w:t>
       </w:r>
@@ -1909,6 +1943,7 @@
         <w:rPr>
           <w:rStyle w:val="Aucun"/>
           <w:rtl w:val="0"/>
+          <w:lang w:val="fr-FR"/>
         </w:rPr>
         <w:t xml:space="preserve">à </w:t>
       </w:r>
@@ -1925,7 +1960,7 @@
       <w:tblPr>
         <w:tblW w:w="9026" w:type="dxa"/>
         <w:jc w:val="left"/>
-        <w:tblInd w:w="108" w:type="dxa"/>
+        <w:tblInd w:w="216" w:type="dxa"/>
         <w:tblBorders>
           <w:top w:val="single" w:color="ffffff" w:sz="8" w:space="0" w:shadow="0" w:frame="0"/>
           <w:left w:val="single" w:color="ffffff" w:sz="8" w:space="0" w:shadow="0" w:frame="0"/>
@@ -1945,7 +1980,7 @@
           <w:shd w:val="clear" w:color="auto" w:fill="cdd4e9"/>
         </w:tblPrEx>
         <w:trPr>
-          <w:trHeight w:val="3610" w:hRule="atLeast"/>
+          <w:trHeight w:val="3672" w:hRule="atLeast"/>
         </w:trPr>
         <w:tc>
           <w:tcPr>
@@ -1958,40 +1993,43 @@
             </w:tcBorders>
             <w:shd w:val="clear" w:color="auto" w:fill="fbfbfb"/>
             <w:tcMar>
-              <w:top w:type="dxa" w:w="0"/>
+              <w:top w:type="dxa" w:w="80"/>
               <w:left w:type="dxa" w:w="80"/>
-              <w:bottom w:type="dxa" w:w="0"/>
+              <w:bottom w:type="dxa" w:w="80"/>
               <w:right w:type="dxa" w:w="80"/>
             </w:tcMar>
             <w:vAlign w:val="center"/>
           </w:tcPr>
           <w:p>
             <w:pPr>
-              <w:spacing w:before="0" w:after="0"/>
-              <w:ind w:left="0" w:right="0" w:firstLine="0"/>
+              <w:pStyle w:val="Corps"/>
               <w:jc w:val="center"/>
             </w:pPr>
             <w:r>
+              <w:rPr>
+                <w:rStyle w:val="Aucun"/>
+                <w:shd w:val="nil" w:color="auto" w:fill="auto"/>
+                <w:lang w:val="en-US"/>
+              </w:rPr>
               <w:drawing xmlns:a="http://schemas.openxmlformats.org/drawingml/2006/main">
                 <wp:inline distT="0" distB="0" distL="0" distR="0">
-                  <wp:extent cx="4816511" cy="2292350"/>
+                  <wp:extent cx="4816512" cy="2292350"/>
                   <wp:effectExtent l="0" t="0" r="0" b="0"/>
-                  <wp:docPr id="1073741825" name="officeArt object"/>
+                  <wp:docPr id="1073741825" name="officeArt object" descr="officeArt object"/>
                   <wp:cNvGraphicFramePr/>
                   <a:graphic xmlns:a="http://schemas.openxmlformats.org/drawingml/2006/main">
                     <a:graphicData uri="http://schemas.openxmlformats.org/drawingml/2006/picture">
                       <pic:pic xmlns:pic="http://schemas.openxmlformats.org/drawingml/2006/picture">
                         <pic:nvPicPr>
-                          <pic:cNvPr id="1073741825" name="Capture d’écran 2026-10-08 à 09.55.40.png"/>
+                          <pic:cNvPr id="1073741825" name="officeArt object" descr="officeArt object"/>
                           <pic:cNvPicPr>
-                            <a:picLocks noChangeAspect="0"/>
+                            <a:picLocks noChangeAspect="1"/>
                           </pic:cNvPicPr>
                         </pic:nvPicPr>
                         <pic:blipFill>
                           <a:blip r:embed="rId4">
                             <a:extLst/>
                           </a:blip>
-                          <a:srcRect l="0" t="0" r="0" b="0"/>
                           <a:stretch>
                             <a:fillRect/>
                           </a:stretch>
@@ -1999,11 +2037,16 @@
                         <pic:spPr>
                           <a:xfrm>
                             <a:off x="0" y="0"/>
-                            <a:ext cx="4816511" cy="2292350"/>
+                            <a:ext cx="4816512" cy="2292350"/>
                           </a:xfrm>
                           <a:prstGeom prst="rect">
                             <a:avLst/>
                           </a:prstGeom>
+                          <a:ln w="12700" cap="flat">
+                            <a:noFill/>
+                            <a:miter lim="400000"/>
+                          </a:ln>
+                          <a:effectLst/>
                         </pic:spPr>
                       </pic:pic>
                     </a:graphicData>
@@ -2017,7 +2060,16 @@
     </w:tbl>
     <w:p>
       <w:pPr>
-        <w:pStyle w:val="Corps"/>
+        <w:pStyle w:val="Corps A"/>
+        <w:keepNext w:val="1"/>
+        <w:widowControl w:val="0"/>
+        <w:spacing w:before="200" w:after="60"/>
+        <w:ind w:left="108" w:hanging="108"/>
+      </w:pPr>
+    </w:p>
+    <w:p>
+      <w:pPr>
+        <w:pStyle w:val="Corps A"/>
         <w:keepNext w:val="1"/>
         <w:widowControl w:val="0"/>
         <w:spacing w:before="200" w:after="60"/>
@@ -2025,7 +2077,7 @@
     </w:p>
     <w:p>
       <w:pPr>
-        <w:pStyle w:val="Corps"/>
+        <w:pStyle w:val="Corps A"/>
         <w:keepNext w:val="1"/>
         <w:spacing w:before="200" w:after="60"/>
       </w:pPr>
@@ -2068,7 +2120,7 @@
       <w:tblPr>
         <w:tblW w:w="9026" w:type="dxa"/>
         <w:jc w:val="left"/>
-        <w:tblInd w:w="108" w:type="dxa"/>
+        <w:tblInd w:w="216" w:type="dxa"/>
         <w:tblBorders>
           <w:top w:val="single" w:color="ffffff" w:sz="8" w:space="0" w:shadow="0" w:frame="0"/>
           <w:left w:val="single" w:color="ffffff" w:sz="8" w:space="0" w:shadow="0" w:frame="0"/>
@@ -2088,7 +2140,7 @@
           <w:shd w:val="clear" w:color="auto" w:fill="cdd4e9"/>
         </w:tblPrEx>
         <w:trPr>
-          <w:trHeight w:val="3450" w:hRule="atLeast"/>
+          <w:trHeight w:val="3460" w:hRule="atLeast"/>
         </w:trPr>
         <w:tc>
           <w:tcPr>
@@ -2099,7 +2151,7 @@
               <w:bottom w:val="dashed" w:color="999999" w:sz="4" w:space="0" w:shadow="0" w:frame="0"/>
               <w:right w:val="dashed" w:color="999999" w:sz="4" w:space="0" w:shadow="0" w:frame="0"/>
             </w:tcBorders>
-            <w:shd w:val="clear" w:color="auto" w:fill="f8f8f8"/>
+            <w:shd w:val="clear" w:color="auto" w:fill="f9f9f8"/>
             <w:tcMar>
               <w:top w:type="dxa" w:w="80"/>
               <w:left w:type="dxa" w:w="80"/>
@@ -2110,7 +2162,7 @@
           </w:tcPr>
           <w:p>
             <w:pPr>
-              <w:pStyle w:val="Corps"/>
+              <w:pStyle w:val="Corps A"/>
               <w:jc w:val="center"/>
             </w:pPr>
             <w:r>
@@ -2138,7 +2190,16 @@
     </w:tbl>
     <w:p>
       <w:pPr>
-        <w:pStyle w:val="Corps"/>
+        <w:pStyle w:val="Corps A"/>
+        <w:keepNext w:val="1"/>
+        <w:widowControl w:val="0"/>
+        <w:spacing w:before="200" w:after="60"/>
+        <w:ind w:left="108" w:hanging="108"/>
+      </w:pPr>
+    </w:p>
+    <w:p>
+      <w:pPr>
+        <w:pStyle w:val="Corps A"/>
         <w:keepNext w:val="1"/>
         <w:widowControl w:val="0"/>
         <w:spacing w:before="200" w:after="60"/>
@@ -2146,7 +2207,7 @@
     </w:p>
     <w:p>
       <w:pPr>
-        <w:pStyle w:val="Corps"/>
+        <w:pStyle w:val="Corps A"/>
         <w:keepNext w:val="1"/>
         <w:spacing w:before="200" w:after="60"/>
       </w:pPr>
@@ -2172,6 +2233,7 @@
         <w:rPr>
           <w:rStyle w:val="Aucun"/>
           <w:rtl w:val="0"/>
+          <w:lang w:val="fr-FR"/>
         </w:rPr>
         <w:t>â</w:t>
       </w:r>
@@ -2268,7 +2330,7 @@
       <w:tblPr>
         <w:tblW w:w="9026" w:type="dxa"/>
         <w:jc w:val="left"/>
-        <w:tblInd w:w="108" w:type="dxa"/>
+        <w:tblInd w:w="216" w:type="dxa"/>
         <w:tblBorders>
           <w:top w:val="single" w:color="ffffff" w:sz="8" w:space="0" w:shadow="0" w:frame="0"/>
           <w:left w:val="single" w:color="ffffff" w:sz="8" w:space="0" w:shadow="0" w:frame="0"/>
@@ -2288,7 +2350,7 @@
           <w:shd w:val="clear" w:color="auto" w:fill="cdd4e9"/>
         </w:tblPrEx>
         <w:trPr>
-          <w:trHeight w:val="3610" w:hRule="atLeast"/>
+          <w:trHeight w:val="3672" w:hRule="atLeast"/>
         </w:trPr>
         <w:tc>
           <w:tcPr>
@@ -2301,40 +2363,43 @@
             </w:tcBorders>
             <w:shd w:val="clear" w:color="auto" w:fill="f9f9f9"/>
             <w:tcMar>
-              <w:top w:type="dxa" w:w="0"/>
+              <w:top w:type="dxa" w:w="80"/>
               <w:left w:type="dxa" w:w="80"/>
-              <w:bottom w:type="dxa" w:w="0"/>
+              <w:bottom w:type="dxa" w:w="80"/>
               <w:right w:type="dxa" w:w="80"/>
             </w:tcMar>
             <w:vAlign w:val="center"/>
           </w:tcPr>
           <w:p>
             <w:pPr>
-              <w:spacing w:before="0" w:after="0"/>
-              <w:ind w:left="0" w:right="0" w:firstLine="0"/>
+              <w:pStyle w:val="Corps"/>
               <w:jc w:val="center"/>
             </w:pPr>
             <w:r>
+              <w:rPr>
+                <w:rStyle w:val="Aucun"/>
+                <w:shd w:val="nil" w:color="auto" w:fill="auto"/>
+                <w:lang w:val="en-US"/>
+              </w:rPr>
               <w:drawing xmlns:a="http://schemas.openxmlformats.org/drawingml/2006/main">
                 <wp:inline distT="0" distB="0" distL="0" distR="0">
                   <wp:extent cx="3252431" cy="2292350"/>
                   <wp:effectExtent l="0" t="0" r="0" b="0"/>
-                  <wp:docPr id="1073741826" name="officeArt object"/>
+                  <wp:docPr id="1073741826" name="officeArt object" descr="officeArt object"/>
                   <wp:cNvGraphicFramePr/>
                   <a:graphic xmlns:a="http://schemas.openxmlformats.org/drawingml/2006/main">
                     <a:graphicData uri="http://schemas.openxmlformats.org/drawingml/2006/picture">
                       <pic:pic xmlns:pic="http://schemas.openxmlformats.org/drawingml/2006/picture">
                         <pic:nvPicPr>
-                          <pic:cNvPr id="1073741826" name="Capture d’écran 2026-10-08 à 09.56.34.png"/>
+                          <pic:cNvPr id="1073741826" name="officeArt object" descr="officeArt object"/>
                           <pic:cNvPicPr>
-                            <a:picLocks noChangeAspect="0"/>
+                            <a:picLocks noChangeAspect="1"/>
                           </pic:cNvPicPr>
                         </pic:nvPicPr>
                         <pic:blipFill>
                           <a:blip r:embed="rId5">
                             <a:extLst/>
                           </a:blip>
-                          <a:srcRect l="0" t="0" r="0" b="0"/>
                           <a:stretch>
                             <a:fillRect/>
                           </a:stretch>
@@ -2347,6 +2412,11 @@
                           <a:prstGeom prst="rect">
                             <a:avLst/>
                           </a:prstGeom>
+                          <a:ln w="12700" cap="flat">
+                            <a:noFill/>
+                            <a:miter lim="400000"/>
+                          </a:ln>
+                          <a:effectLst/>
                         </pic:spPr>
                       </pic:pic>
                     </a:graphicData>
@@ -2360,7 +2430,16 @@
     </w:tbl>
     <w:p>
       <w:pPr>
-        <w:pStyle w:val="Corps"/>
+        <w:pStyle w:val="Corps A"/>
+        <w:keepNext w:val="1"/>
+        <w:widowControl w:val="0"/>
+        <w:spacing w:before="200" w:after="60"/>
+        <w:ind w:left="108" w:hanging="108"/>
+      </w:pPr>
+    </w:p>
+    <w:p>
+      <w:pPr>
+        <w:pStyle w:val="Corps A"/>
         <w:keepNext w:val="1"/>
         <w:widowControl w:val="0"/>
         <w:spacing w:before="200" w:after="60"/>
@@ -2368,7 +2447,7 @@
     </w:p>
     <w:p>
       <w:pPr>
-        <w:pStyle w:val="Corps"/>
+        <w:pStyle w:val="Corps A"/>
         <w:keepNext w:val="1"/>
         <w:widowControl w:val="0"/>
         <w:spacing w:before="200" w:after="60"/>
@@ -2376,7 +2455,7 @@
     </w:p>
     <w:p>
       <w:pPr>
-        <w:pStyle w:val="Corps"/>
+        <w:pStyle w:val="Corps A"/>
         <w:keepNext w:val="1"/>
         <w:widowControl w:val="0"/>
         <w:spacing w:before="200" w:after="60"/>
@@ -2384,7 +2463,7 @@
     </w:p>
     <w:p>
       <w:pPr>
-        <w:pStyle w:val="Corps"/>
+        <w:pStyle w:val="Corps A"/>
         <w:keepNext w:val="1"/>
         <w:spacing w:before="200" w:after="60"/>
       </w:pPr>
@@ -2404,19 +2483,10 @@
           <w:b w:val="1"/>
           <w:bCs w:val="1"/>
           <w:rtl w:val="0"/>
+          <w:lang w:val="fr-FR"/>
         </w:rPr>
         <w:tab/>
-        <w:t>4</w:t>
-      </w:r>
-      <w:r>
-        <w:rPr>
-          <w:rStyle w:val="Aucun"/>
-          <w:b w:val="1"/>
-          <w:bCs w:val="1"/>
-          <w:rtl w:val="0"/>
-          <w:lang w:val="fr-FR"/>
-        </w:rPr>
-        <w:t xml:space="preserve"> : </w:t>
+        <w:t xml:space="preserve">4 : </w:t>
       </w:r>
       <w:r>
         <w:rPr>
@@ -2454,6 +2524,7 @@
         <w:rPr>
           <w:rStyle w:val="Aucun"/>
           <w:rtl w:val="0"/>
+          <w:lang w:val="fr-FR"/>
         </w:rPr>
         <w:t>.</w:t>
       </w:r>
@@ -2462,7 +2533,7 @@
       <w:tblPr>
         <w:tblW w:w="9026" w:type="dxa"/>
         <w:jc w:val="left"/>
-        <w:tblInd w:w="108" w:type="dxa"/>
+        <w:tblInd w:w="216" w:type="dxa"/>
         <w:tblBorders>
           <w:top w:val="single" w:color="ffffff" w:sz="8" w:space="0" w:shadow="0" w:frame="0"/>
           <w:left w:val="single" w:color="ffffff" w:sz="8" w:space="0" w:shadow="0" w:frame="0"/>
@@ -2482,7 +2553,7 @@
           <w:shd w:val="clear" w:color="auto" w:fill="cdd4e9"/>
         </w:tblPrEx>
         <w:trPr>
-          <w:trHeight w:val="3610" w:hRule="atLeast"/>
+          <w:trHeight w:val="3672" w:hRule="atLeast"/>
         </w:trPr>
         <w:tc>
           <w:tcPr>
@@ -2495,40 +2566,43 @@
             </w:tcBorders>
             <w:shd w:val="clear" w:color="auto" w:fill="fcfcfc"/>
             <w:tcMar>
-              <w:top w:type="dxa" w:w="0"/>
+              <w:top w:type="dxa" w:w="80"/>
               <w:left w:type="dxa" w:w="80"/>
-              <w:bottom w:type="dxa" w:w="0"/>
+              <w:bottom w:type="dxa" w:w="80"/>
               <w:right w:type="dxa" w:w="80"/>
             </w:tcMar>
             <w:vAlign w:val="center"/>
           </w:tcPr>
           <w:p>
             <w:pPr>
-              <w:spacing w:before="0" w:after="0"/>
-              <w:ind w:left="0" w:right="0" w:firstLine="0"/>
+              <w:pStyle w:val="Corps"/>
               <w:jc w:val="center"/>
             </w:pPr>
             <w:r>
+              <w:rPr>
+                <w:rStyle w:val="Aucun"/>
+                <w:shd w:val="nil" w:color="auto" w:fill="auto"/>
+                <w:lang w:val="en-US"/>
+              </w:rPr>
               <w:drawing xmlns:a="http://schemas.openxmlformats.org/drawingml/2006/main">
                 <wp:inline distT="0" distB="0" distL="0" distR="0">
                   <wp:extent cx="3527394" cy="2292350"/>
                   <wp:effectExtent l="0" t="0" r="0" b="0"/>
-                  <wp:docPr id="1073741827" name="officeArt object"/>
+                  <wp:docPr id="1073741827" name="officeArt object" descr="officeArt object"/>
                   <wp:cNvGraphicFramePr/>
                   <a:graphic xmlns:a="http://schemas.openxmlformats.org/drawingml/2006/main">
                     <a:graphicData uri="http://schemas.openxmlformats.org/drawingml/2006/picture">
                       <pic:pic xmlns:pic="http://schemas.openxmlformats.org/drawingml/2006/picture">
                         <pic:nvPicPr>
-                          <pic:cNvPr id="1073741827" name="Capture d’écran 2026-10-08 à 09.57.49.png"/>
+                          <pic:cNvPr id="1073741827" name="officeArt object" descr="officeArt object"/>
                           <pic:cNvPicPr>
-                            <a:picLocks noChangeAspect="0"/>
+                            <a:picLocks noChangeAspect="1"/>
                           </pic:cNvPicPr>
                         </pic:nvPicPr>
                         <pic:blipFill>
                           <a:blip r:embed="rId6">
                             <a:extLst/>
                           </a:blip>
-                          <a:srcRect l="0" t="0" r="0" b="0"/>
                           <a:stretch>
                             <a:fillRect/>
                           </a:stretch>
@@ -2541,6 +2615,11 @@
                           <a:prstGeom prst="rect">
                             <a:avLst/>
                           </a:prstGeom>
+                          <a:ln w="12700" cap="flat">
+                            <a:noFill/>
+                            <a:miter lim="400000"/>
+                          </a:ln>
+                          <a:effectLst/>
                         </pic:spPr>
                       </pic:pic>
                     </a:graphicData>
@@ -2554,7 +2633,16 @@
     </w:tbl>
     <w:p>
       <w:pPr>
-        <w:pStyle w:val="Corps"/>
+        <w:pStyle w:val="Corps A"/>
+        <w:keepNext w:val="1"/>
+        <w:widowControl w:val="0"/>
+        <w:spacing w:before="200" w:after="60"/>
+        <w:ind w:left="108" w:hanging="108"/>
+      </w:pPr>
+    </w:p>
+    <w:p>
+      <w:pPr>
+        <w:pStyle w:val="Corps A"/>
         <w:keepNext w:val="1"/>
         <w:widowControl w:val="0"/>
         <w:spacing w:before="200" w:after="60"/>
@@ -2562,7 +2650,7 @@
     </w:p>
     <w:p>
       <w:pPr>
-        <w:pStyle w:val="Corps"/>
+        <w:pStyle w:val="Corps A"/>
         <w:keepNext w:val="1"/>
         <w:spacing w:before="200" w:after="60"/>
       </w:pPr>
@@ -2584,17 +2672,7 @@
           <w:rtl w:val="0"/>
           <w:lang w:val="fr-FR"/>
         </w:rPr>
-        <w:t>5</w:t>
-      </w:r>
-      <w:r>
-        <w:rPr>
-          <w:rStyle w:val="Aucun"/>
-          <w:b w:val="1"/>
-          <w:bCs w:val="1"/>
-          <w:rtl w:val="0"/>
-          <w:lang w:val="fr-FR"/>
-        </w:rPr>
-        <w:t xml:space="preserve"> : </w:t>
+        <w:t xml:space="preserve">5 : </w:t>
       </w:r>
       <w:r>
         <w:rPr>
@@ -2656,6 +2734,7 @@
         <w:rPr>
           <w:rStyle w:val="Aucun"/>
           <w:rtl w:val="0"/>
+          <w:lang w:val="fr-FR"/>
         </w:rPr>
         <w:t xml:space="preserve">à </w:t>
       </w:r>
@@ -2672,7 +2751,7 @@
       <w:tblPr>
         <w:tblW w:w="9026" w:type="dxa"/>
         <w:jc w:val="left"/>
-        <w:tblInd w:w="108" w:type="dxa"/>
+        <w:tblInd w:w="216" w:type="dxa"/>
         <w:tblBorders>
           <w:top w:val="single" w:color="ffffff" w:sz="8" w:space="0" w:shadow="0" w:frame="0"/>
           <w:left w:val="single" w:color="ffffff" w:sz="8" w:space="0" w:shadow="0" w:frame="0"/>
@@ -2692,7 +2771,7 @@
           <w:shd w:val="clear" w:color="auto" w:fill="cdd4e9"/>
         </w:tblPrEx>
         <w:trPr>
-          <w:trHeight w:val="3610" w:hRule="atLeast"/>
+          <w:trHeight w:val="3672" w:hRule="atLeast"/>
         </w:trPr>
         <w:tc>
           <w:tcPr>
@@ -2705,40 +2784,51 @@
             </w:tcBorders>
             <w:shd w:val="clear" w:color="auto" w:fill="1e1e1e"/>
             <w:tcMar>
-              <w:top w:type="dxa" w:w="0"/>
+              <w:top w:type="dxa" w:w="80"/>
               <w:left w:type="dxa" w:w="80"/>
-              <w:bottom w:type="dxa" w:w="0"/>
+              <w:bottom w:type="dxa" w:w="80"/>
               <w:right w:type="dxa" w:w="80"/>
             </w:tcMar>
             <w:vAlign w:val="center"/>
           </w:tcPr>
           <w:p>
             <w:pPr>
-              <w:spacing w:before="0" w:after="0"/>
-              <w:ind w:left="0" w:right="0" w:firstLine="0"/>
+              <w:pStyle w:val="Corps"/>
               <w:jc w:val="center"/>
             </w:pPr>
             <w:r>
+              <w:rPr>
+                <w:rStyle w:val="Aucun"/>
+                <w:outline w:val="0"/>
+                <w:color w:val="ffffff"/>
+                <w:u w:color="ffffff"/>
+                <w:shd w:val="nil" w:color="auto" w:fill="auto"/>
+                <w:lang w:val="en-US"/>
+                <w14:textFill>
+                  <w14:solidFill>
+                    <w14:srgbClr w14:val="FFFFFF"/>
+                  </w14:solidFill>
+                </w14:textFill>
+              </w:rPr>
               <w:drawing xmlns:a="http://schemas.openxmlformats.org/drawingml/2006/main">
                 <wp:inline distT="0" distB="0" distL="0" distR="0">
                   <wp:extent cx="3760259" cy="2292350"/>
                   <wp:effectExtent l="0" t="0" r="0" b="0"/>
-                  <wp:docPr id="1073741828" name="officeArt object"/>
+                  <wp:docPr id="1073741828" name="officeArt object" descr="officeArt object"/>
                   <wp:cNvGraphicFramePr/>
                   <a:graphic xmlns:a="http://schemas.openxmlformats.org/drawingml/2006/main">
                     <a:graphicData uri="http://schemas.openxmlformats.org/drawingml/2006/picture">
                       <pic:pic xmlns:pic="http://schemas.openxmlformats.org/drawingml/2006/picture">
                         <pic:nvPicPr>
-                          <pic:cNvPr id="1073741828" name="Capture d’écran 2026-10-08 à 09.57.59.png"/>
+                          <pic:cNvPr id="1073741828" name="officeArt object" descr="officeArt object"/>
                           <pic:cNvPicPr>
-                            <a:picLocks noChangeAspect="0"/>
+                            <a:picLocks noChangeAspect="1"/>
                           </pic:cNvPicPr>
                         </pic:nvPicPr>
                         <pic:blipFill>
                           <a:blip r:embed="rId7">
                             <a:extLst/>
                           </a:blip>
-                          <a:srcRect l="0" t="0" r="0" b="0"/>
                           <a:stretch>
                             <a:fillRect/>
                           </a:stretch>
@@ -2751,6 +2841,11 @@
                           <a:prstGeom prst="rect">
                             <a:avLst/>
                           </a:prstGeom>
+                          <a:ln w="12700" cap="flat">
+                            <a:noFill/>
+                            <a:miter lim="400000"/>
+                          </a:ln>
+                          <a:effectLst/>
                         </pic:spPr>
                       </pic:pic>
                     </a:graphicData>
@@ -2764,7 +2859,16 @@
     </w:tbl>
     <w:p>
       <w:pPr>
-        <w:pStyle w:val="Corps"/>
+        <w:pStyle w:val="Corps A"/>
+        <w:keepNext w:val="1"/>
+        <w:widowControl w:val="0"/>
+        <w:spacing w:before="200" w:after="60"/>
+        <w:ind w:left="108" w:hanging="108"/>
+      </w:pPr>
+    </w:p>
+    <w:p>
+      <w:pPr>
+        <w:pStyle w:val="Corps A"/>
         <w:keepNext w:val="1"/>
         <w:widowControl w:val="0"/>
         <w:spacing w:before="200" w:after="60"/>
@@ -2772,7 +2876,7 @@
     </w:p>
     <w:p>
       <w:pPr>
-        <w:pStyle w:val="Corps"/>
+        <w:pStyle w:val="Corps A"/>
         <w:keepNext w:val="1"/>
         <w:widowControl w:val="0"/>
         <w:spacing w:before="200" w:after="60"/>
@@ -2780,11 +2884,12 @@
     </w:p>
     <w:p>
       <w:pPr>
-        <w:pStyle w:val="Corps"/>
+        <w:pStyle w:val="Corps A"/>
         <w:keepNext w:val="1"/>
         <w:widowControl w:val="0"/>
         <w:spacing w:before="200" w:after="60"/>
         <w:rPr>
+          <w:rStyle w:val="Aucun"/>
           <w:b w:val="1"/>
           <w:bCs w:val="1"/>
         </w:rPr>
@@ -2792,7 +2897,7 @@
     </w:p>
     <w:p>
       <w:pPr>
-        <w:pStyle w:val="Corps"/>
+        <w:pStyle w:val="Corps A"/>
         <w:keepNext w:val="1"/>
         <w:widowControl w:val="0"/>
         <w:spacing w:before="200" w:after="60"/>
@@ -2800,7 +2905,7 @@
     </w:p>
     <w:p>
       <w:pPr>
-        <w:pStyle w:val="Corps"/>
+        <w:pStyle w:val="Corps A"/>
         <w:keepNext w:val="1"/>
         <w:widowControl w:val="0"/>
         <w:spacing w:before="200" w:after="60"/>
@@ -2808,7 +2913,7 @@
     </w:p>
     <w:p>
       <w:pPr>
-        <w:pStyle w:val="Corps"/>
+        <w:pStyle w:val="Corps A"/>
         <w:keepNext w:val="1"/>
         <w:widowControl w:val="0"/>
         <w:spacing w:before="200" w:after="60"/>
@@ -2816,7 +2921,7 @@
     </w:p>
     <w:p>
       <w:pPr>
-        <w:pStyle w:val="Corps"/>
+        <w:pStyle w:val="Corps A"/>
         <w:keepNext w:val="1"/>
         <w:widowControl w:val="0"/>
         <w:spacing w:before="200" w:after="60"/>
@@ -2824,7 +2929,7 @@
     </w:p>
     <w:p>
       <w:pPr>
-        <w:pStyle w:val="Corps"/>
+        <w:pStyle w:val="Corps A"/>
         <w:keepNext w:val="1"/>
         <w:widowControl w:val="0"/>
         <w:spacing w:before="200" w:after="60"/>
@@ -2832,7 +2937,7 @@
     </w:p>
     <w:p>
       <w:pPr>
-        <w:pStyle w:val="Corps"/>
+        <w:pStyle w:val="Corps A"/>
         <w:keepNext w:val="1"/>
         <w:widowControl w:val="0"/>
         <w:spacing w:before="200" w:after="60"/>
@@ -2840,7 +2945,7 @@
     </w:p>
     <w:p>
       <w:pPr>
-        <w:pStyle w:val="Corps"/>
+        <w:pStyle w:val="Corps A"/>
         <w:keepNext w:val="1"/>
         <w:widowControl w:val="0"/>
         <w:spacing w:before="200" w:after="60"/>
@@ -2848,15 +2953,7 @@
     </w:p>
     <w:p>
       <w:pPr>
-        <w:pStyle w:val="Corps"/>
-        <w:keepNext w:val="1"/>
-        <w:widowControl w:val="0"/>
-        <w:spacing w:before="200" w:after="60"/>
-      </w:pPr>
-    </w:p>
-    <w:p>
-      <w:pPr>
-        <w:pStyle w:val="Corps"/>
+        <w:pStyle w:val="Corps A"/>
         <w:keepNext w:val="1"/>
         <w:widowControl w:val="0"/>
         <w:spacing w:before="200" w:after="60"/>
@@ -3056,7 +3153,7 @@
   </w:style>
   <w:style w:type="paragraph" w:styleId="Titre rouge">
     <w:name w:val="Titre rouge"/>
-    <w:next w:val="Corps"/>
+    <w:next w:val="Corps A"/>
     <w:pPr>
       <w:keepNext w:val="1"/>
       <w:keepLines w:val="0"/>
@@ -3081,18 +3178,19 @@
       <w:strike w:val="0"/>
       <w:dstrike w:val="0"/>
       <w:outline w:val="0"/>
-      <w:color w:val="ed220b"/>
+      <w:color w:val="ee220c"/>
       <w:spacing w:val="0"/>
       <w:kern w:val="0"/>
       <w:position w:val="0"/>
       <w:sz w:val="32"/>
       <w:szCs w:val="32"/>
-      <w:u w:val="none"/>
+      <w:u w:val="none" w:color="ee220c"/>
       <w:shd w:val="nil" w:color="auto" w:fill="auto"/>
       <w:vertAlign w:val="baseline"/>
       <w:lang w:val="fr-FR"/>
-      <w14:textOutline>
+      <w14:textOutline w14:w="12700" w14:cap="flat">
         <w14:noFill/>
+        <w14:miter w14:lim="400000"/>
       </w14:textOutline>
       <w14:textFill>
         <w14:solidFill>
@@ -3101,9 +3199,9 @@
       </w14:textFill>
     </w:rPr>
   </w:style>
-  <w:style w:type="paragraph" w:styleId="Corps">
-    <w:name w:val="Corps"/>
-    <w:next w:val="Corps"/>
+  <w:style w:type="paragraph" w:styleId="Corps A">
+    <w:name w:val="Corps A"/>
+    <w:next w:val="Corps A"/>
     <w:pPr>
       <w:keepNext w:val="0"/>
       <w:keepLines w:val="0"/>
@@ -3138,8 +3236,9 @@
       <w:shd w:val="nil" w:color="auto" w:fill="auto"/>
       <w:vertAlign w:val="baseline"/>
       <w:lang w:val="fr-FR"/>
-      <w14:textOutline>
+      <w14:textOutline w14:w="12700" w14:cap="flat">
         <w14:noFill/>
+        <w14:miter w14:lim="400000"/>
       </w14:textOutline>
       <w14:textFill>
         <w14:solidFill>
@@ -3154,9 +3253,9 @@
       <w:lang w:val="fr-FR"/>
     </w:rPr>
   </w:style>
-  <w:style w:type="paragraph" w:styleId="Titre">
-    <w:name w:val="Titre"/>
-    <w:next w:val="Corps"/>
+  <w:style w:type="paragraph" w:styleId="Titre A">
+    <w:name w:val="Titre A"/>
+    <w:next w:val="Corps A"/>
     <w:pPr>
       <w:keepNext w:val="0"/>
       <w:keepLines w:val="0"/>
@@ -3191,12 +3290,59 @@
       <w:shd w:val="nil" w:color="auto" w:fill="auto"/>
       <w:vertAlign w:val="baseline"/>
       <w:lang w:val="fr-FR"/>
+      <w14:textOutline w14:w="12700" w14:cap="flat">
+        <w14:noFill/>
+        <w14:miter w14:lim="400000"/>
+      </w14:textOutline>
+      <w14:textFill>
+        <w14:solidFill>
+          <w14:srgbClr w14:val="222222"/>
+        </w14:solidFill>
+      </w14:textFill>
+    </w:rPr>
+  </w:style>
+  <w:style w:type="paragraph" w:styleId="Corps">
+    <w:name w:val="Corps"/>
+    <w:next w:val="Corps"/>
+    <w:pPr>
+      <w:keepNext w:val="0"/>
+      <w:keepLines w:val="0"/>
+      <w:pageBreakBefore w:val="0"/>
+      <w:widowControl w:val="1"/>
+      <w:shd w:val="clear" w:color="auto" w:fill="auto"/>
+      <w:suppressAutoHyphens w:val="0"/>
+      <w:bidi w:val="0"/>
+      <w:spacing w:before="0" w:after="0" w:line="240" w:lineRule="auto"/>
+      <w:ind w:left="0" w:right="0" w:firstLine="0"/>
+      <w:jc w:val="left"/>
+      <w:outlineLvl w:val="9"/>
+    </w:pPr>
+    <w:rPr>
+      <w:rFonts w:ascii="Times New Roman" w:cs="Times New Roman" w:hAnsi="Times New Roman" w:eastAsia="Times New Roman"/>
+      <w:b w:val="0"/>
+      <w:bCs w:val="0"/>
+      <w:i w:val="0"/>
+      <w:iCs w:val="0"/>
+      <w:caps w:val="0"/>
+      <w:smallCaps w:val="0"/>
+      <w:strike w:val="0"/>
+      <w:dstrike w:val="0"/>
+      <w:outline w:val="0"/>
+      <w:color w:val="000000"/>
+      <w:spacing w:val="0"/>
+      <w:kern w:val="0"/>
+      <w:position w:val="0"/>
+      <w:sz w:val="24"/>
+      <w:szCs w:val="24"/>
+      <w:u w:val="none" w:color="000000"/>
+      <w:shd w:val="nil" w:color="auto" w:fill="auto"/>
+      <w:vertAlign w:val="baseline"/>
       <w14:textOutline>
         <w14:noFill/>
       </w14:textOutline>
       <w14:textFill>
         <w14:solidFill>
-          <w14:srgbClr w14:val="222222"/>
+          <w14:srgbClr w14:val="000000"/>
         </w14:solidFill>
       </w14:textFill>
     </w:rPr>
@@ -3247,9 +3393,9 @@
     </a:clrScheme>
     <a:fontScheme name="Office Theme">
       <a:majorFont>
-        <a:latin typeface="Helvetica Neue"/>
-        <a:ea typeface="Helvetica Neue"/>
-        <a:cs typeface="Helvetica Neue"/>
+        <a:latin typeface="Calibri"/>
+        <a:ea typeface="Calibri"/>
+        <a:cs typeface="Calibri"/>
       </a:majorFont>
       <a:minorFont>
         <a:latin typeface="Helvetica Neue"/>
@@ -3397,17 +3543,17 @@
         <a:solidFill>
           <a:srgbClr val="FFFFFF"/>
         </a:solidFill>
-        <a:ln w="12700" cap="flat">
+        <a:ln w="25400" cap="flat">
           <a:solidFill>
             <a:schemeClr val="accent1"/>
           </a:solidFill>
           <a:prstDash val="solid"/>
-          <a:miter lim="800000"/>
+          <a:round/>
         </a:ln>
         <a:effectLst/>
         <a:sp3d/>
       </a:spPr>
-      <a:bodyPr rot="0" spcFirstLastPara="1" vertOverflow="overflow" horzOverflow="overflow" vert="horz" wrap="square" lIns="45719" tIns="45719" rIns="45719" bIns="45719" numCol="1" spcCol="38100" rtlCol="0" anchor="ctr" upright="0">
+      <a:bodyPr rot="0" spcFirstLastPara="1" vertOverflow="overflow" horzOverflow="overflow" vert="horz" wrap="square" lIns="45718" tIns="45718" rIns="45718" bIns="45718" numCol="1" spcCol="38100" rtlCol="0" anchor="ctr" upright="0">
         <a:spAutoFit/>
       </a:bodyPr>
       <a:lstStyle>
@@ -3435,10 +3581,10 @@
             </a:solidFill>
             <a:effectLst/>
             <a:uFillTx/>
-            <a:latin typeface="Calibri"/>
-            <a:ea typeface="Calibri"/>
-            <a:cs typeface="Calibri"/>
-            <a:sym typeface="Calibri"/>
+            <a:latin typeface="+mn-lt"/>
+            <a:ea typeface="+mn-ea"/>
+            <a:cs typeface="+mn-cs"/>
+            <a:sym typeface="Helvetica Neue"/>
           </a:defRPr>
         </a:defPPr>
         <a:lvl1pPr marL="0" marR="0" indent="0" algn="l" defTabSz="914400" rtl="0" fontAlgn="auto" latinLnBrk="1" hangingPunct="0">
@@ -3686,12 +3832,12 @@
     <a:lnDef>
       <a:spPr>
         <a:noFill/>
-        <a:ln w="12700" cap="flat">
+        <a:ln w="25400" cap="flat">
           <a:solidFill>
             <a:schemeClr val="accent1"/>
           </a:solidFill>
           <a:prstDash val="solid"/>
-          <a:miter lim="800000"/>
+          <a:round/>
         </a:ln>
         <a:effectLst/>
         <a:sp3d/>
@@ -3978,7 +4124,7 @@
         <a:effectLst/>
         <a:sp3d/>
       </a:spPr>
-      <a:bodyPr rot="0" spcFirstLastPara="1" vertOverflow="overflow" horzOverflow="overflow" vert="horz" wrap="square" lIns="45719" tIns="45719" rIns="45719" bIns="45719" numCol="1" spcCol="38100" rtlCol="0" anchor="t" upright="0">
+      <a:bodyPr rot="0" spcFirstLastPara="1" vertOverflow="overflow" horzOverflow="overflow" vert="horz" wrap="square" lIns="45718" tIns="45718" rIns="45718" bIns="45718" numCol="1" spcCol="38100" rtlCol="0" anchor="t" upright="0">
         <a:spAutoFit/>
       </a:bodyPr>
       <a:lstStyle>
@@ -4006,10 +4152,10 @@
             </a:solidFill>
             <a:effectLst/>
             <a:uFillTx/>
-            <a:latin typeface="Calibri"/>
-            <a:ea typeface="Calibri"/>
-            <a:cs typeface="Calibri"/>
-            <a:sym typeface="Calibri"/>
+            <a:latin typeface="+mn-lt"/>
+            <a:ea typeface="+mn-ea"/>
+            <a:cs typeface="+mn-cs"/>
+            <a:sym typeface="Helvetica Neue"/>
           </a:defRPr>
         </a:defPPr>
         <a:lvl1pPr marL="0" marR="0" indent="0" algn="l" defTabSz="914400" rtl="0" fontAlgn="auto" latinLnBrk="1" hangingPunct="0">

</xml_diff>